<commit_message>
Recherche eingearbeitet: geprüfte Werke, korrigierte Daten, Quellen und Bildnachweise
Co-Authored-By: Claude Opus 5.5 <noreply@anthropic.com>
Claude-Session: https://claude.ai/code/session_01XKdu8uiUBwzdSo25VMnQHA
</commit_message>
<xml_diff>
--- a/Handout_Fotorealismus_Hyperrealismus.docx
+++ b/Handout_Fotorealismus_Hyperrealismus.docx
@@ -16,13 +16,13 @@
         <w:tblLayout w:type="fixed"/>
       </w:tblPr>
       <w:tblGrid>
-        <w:gridCol w:w="6810"/>
-        <w:gridCol w:w="3508"/>
+        <w:gridCol w:w="7223"/>
+        <w:gridCol w:w="3095"/>
       </w:tblGrid>
       <w:tr>
         <w:tc>
           <w:tcPr>
-            <w:tcW w:type="dxa" w:w="6810"/>
+            <w:tcW w:type="dxa" w:w="7223"/>
             <w:tcMar>
               <w:top w:type="dxa" w:w="40"/>
               <w:left w:type="dxa" w:w="0"/>
@@ -33,7 +33,7 @@
           </w:tcPr>
           <w:p>
             <w:pPr>
-              <w:spacing w:after="20" w:before="0" w:line="252"/>
+              <w:spacing w:after="20" w:before="0" w:line="252" w:lineRule="auto"/>
             </w:pPr>
             <w:r>
               <w:rPr>
@@ -49,7 +49,7 @@
           </w:p>
           <w:p>
             <w:pPr>
-              <w:spacing w:after="0" w:before="0" w:line="252"/>
+              <w:spacing w:after="0" w:before="0" w:line="240" w:lineRule="auto"/>
             </w:pPr>
             <w:r>
               <w:rPr>
@@ -57,8 +57,8 @@
                 <w:b/>
                 <w:bCs/>
                 <w:color w:val="1A1A1A"/>
-                <w:sz w:val="38"/>
-                <w:szCs w:val="38"/>
+                <w:sz w:val="34"/>
+                <w:szCs w:val="34"/>
               </w:rPr>
               <w:t xml:space="preserve">Fotorealismus &amp; Hyperrealismus</w:t>
             </w:r>
@@ -66,7 +66,7 @@
         </w:tc>
         <w:tc>
           <w:tcPr>
-            <w:tcW w:type="dxa" w:w="3508"/>
+            <w:tcW w:type="dxa" w:w="3095"/>
             <w:tcMar>
               <w:top w:type="dxa" w:w="40"/>
               <w:left w:type="dxa" w:w="90"/>
@@ -77,7 +77,7 @@
           </w:tcPr>
           <w:p>
             <w:pPr>
-              <w:spacing w:after="50" w:before="0" w:line="252"/>
+              <w:spacing w:after="50" w:before="0" w:line="252" w:lineRule="auto"/>
               <w:jc w:val="right"/>
             </w:pPr>
             <w:r>
@@ -92,7 +92,7 @@
           </w:p>
           <w:p>
             <w:pPr>
-              <w:spacing w:after="0" w:before="0" w:line="252"/>
+              <w:spacing w:after="0" w:before="0" w:line="252" w:lineRule="auto"/>
               <w:jc w:val="right"/>
             </w:pPr>
             <w:r>
@@ -110,7 +110,7 @@
     </w:tbl>
     <w:p>
       <w:pPr>
-        <w:spacing w:after="0" w:before="60" w:line="252"/>
+        <w:spacing w:after="0" w:before="60" w:line="252" w:lineRule="auto"/>
       </w:pPr>
       <w:r>
         <w:rPr>
@@ -157,7 +157,7 @@
     </w:p>
     <w:p>
       <w:pPr>
-        <w:spacing w:after="70" w:before="0" w:line="252"/>
+        <w:spacing w:after="70" w:before="0" w:line="252" w:lineRule="auto"/>
       </w:pPr>
       <w:r>
         <w:rPr>
@@ -166,7 +166,7 @@
           <w:sz w:val="18"/>
           <w:szCs w:val="18"/>
         </w:rPr>
-        <w:t xml:space="preserve">Der Fotorealismus entsteht Ende der 1960er-Jahre in den USA (v. a. Kalifornien und New York). Er knüpft an die Pop Art an, die Werbung und Alltagsbilder in die Kunst geholt hatte, und stellt sich gegen die damals vorherrschende abstrakte Malerei. Ab den 1970er-Jahren verbreitet er sich in Europa; der verwandte Begriff Hyperrealismus steht für eine Weiterentwicklung, die seit etwa 2000 einen Boom erlebt.</w:t>
+        <w:t xml:space="preserve">Der Fotorealismus entsteht Ende der 1960er-Jahre in den USA (v. a. New York und Kalifornien) als Gegenbewegung zum Abstrakten Expressionismus mit seinem sichtbaren Pinselgestus. Von der Pop Art übernimmt er den Blick auf Werbung, Konsum und Alltag. Ab 1972 wird er in Europa bekannt; in Deutschland malt Gerhard Richter schon ab 1962 nach Fotos, verwischt sie aber bewusst (Fotomalerei). Der Begriff Hyperrealismus (ab 1973) steht heute vor allem für die Weiterentwicklung, die seit etwa 2000 boomt.</w:t>
       </w:r>
     </w:p>
     <w:tbl>
@@ -201,7 +201,7 @@
           </w:tcPr>
           <w:p>
             <w:pPr>
-              <w:spacing w:after="0" w:before="0" w:line="252"/>
+              <w:spacing w:after="0" w:before="0" w:line="252" w:lineRule="auto"/>
             </w:pPr>
             <w:r>
               <w:rPr>
@@ -230,16 +230,16 @@
           </w:tcPr>
           <w:p>
             <w:pPr>
-              <w:spacing w:after="0" w:before="0" w:line="252"/>
-            </w:pPr>
-            <w:r>
-              <w:rPr>
-                <w:rFonts w:ascii="Arial" w:cs="Arial" w:eastAsia="Arial" w:hAnsi="Arial"/>
-                <w:color w:val="1A1A1A"/>
-                <w:sz w:val="18"/>
-                <w:szCs w:val="18"/>
-              </w:rPr>
-              <w:t xml:space="preserve">Pop Art (z. B. Andy Warhol, Roy Lichtenstein) macht Werbung, Konsum und Medienbilder kunstwürdig.</w:t>
+              <w:spacing w:after="0" w:before="0" w:line="252" w:lineRule="auto"/>
+            </w:pPr>
+            <w:r>
+              <w:rPr>
+                <w:rFonts w:ascii="Arial" w:cs="Arial" w:eastAsia="Arial" w:hAnsi="Arial"/>
+                <w:color w:val="1A1A1A"/>
+                <w:sz w:val="18"/>
+                <w:szCs w:val="18"/>
+              </w:rPr>
+              <w:t xml:space="preserve">Pop Art (z. B. Andy Warhol, Roy Lichtenstein) macht Werbung, Konsum und Medienbilder kunstwürdig – Gegenpol zur abstrakten Malerei.</w:t>
             </w:r>
           </w:p>
         </w:tc>
@@ -258,7 +258,7 @@
           </w:tcPr>
           <w:p>
             <w:pPr>
-              <w:spacing w:after="0" w:before="0" w:line="252"/>
+              <w:spacing w:after="0" w:before="0" w:line="252" w:lineRule="auto"/>
             </w:pPr>
             <w:r>
               <w:rPr>
@@ -286,16 +286,16 @@
           </w:tcPr>
           <w:p>
             <w:pPr>
-              <w:spacing w:after="0" w:before="0" w:line="252"/>
-            </w:pPr>
-            <w:r>
-              <w:rPr>
-                <w:rFonts w:ascii="Arial" w:cs="Arial" w:eastAsia="Arial" w:hAnsi="Arial"/>
-                <w:color w:val="1A1A1A"/>
-                <w:sz w:val="18"/>
-                <w:szCs w:val="18"/>
-              </w:rPr>
-              <w:t xml:space="preserve">Malcolm Morley malt „SS Amsterdam in Front of Rotterdam“ nach einer Postkarte – ein frühes Schlüsselwerk.</w:t>
+              <w:spacing w:after="0" w:before="0" w:line="252" w:lineRule="auto"/>
+            </w:pPr>
+            <w:r>
+              <w:rPr>
+                <w:rFonts w:ascii="Arial" w:cs="Arial" w:eastAsia="Arial" w:hAnsi="Arial"/>
+                <w:color w:val="1A1A1A"/>
+                <w:sz w:val="18"/>
+                <w:szCs w:val="18"/>
+              </w:rPr>
+              <w:t xml:space="preserve">Malcolm Morley malt „SS Amsterdam in Front of Rotterdam“ nach einem gedruckten Werbebild – ein frühes Schlüsselwerk.</w:t>
             </w:r>
           </w:p>
         </w:tc>
@@ -315,7 +315,7 @@
           </w:tcPr>
           <w:p>
             <w:pPr>
-              <w:spacing w:after="0" w:before="0" w:line="252"/>
+              <w:spacing w:after="0" w:before="0" w:line="252" w:lineRule="auto"/>
             </w:pPr>
             <w:r>
               <w:rPr>
@@ -344,16 +344,16 @@
           </w:tcPr>
           <w:p>
             <w:pPr>
-              <w:spacing w:after="0" w:before="0" w:line="252"/>
-            </w:pPr>
-            <w:r>
-              <w:rPr>
-                <w:rFonts w:ascii="Arial" w:cs="Arial" w:eastAsia="Arial" w:hAnsi="Arial"/>
-                <w:color w:val="1A1A1A"/>
-                <w:sz w:val="18"/>
-                <w:szCs w:val="18"/>
-              </w:rPr>
-              <w:t xml:space="preserve">Der New Yorker Galerist Louis K. Meisel prägt den Begriff „Photo-Realism“ (Fotorealismus).</w:t>
+              <w:spacing w:after="0" w:before="0" w:line="252" w:lineRule="auto"/>
+            </w:pPr>
+            <w:r>
+              <w:rPr>
+                <w:rFonts w:ascii="Arial" w:cs="Arial" w:eastAsia="Arial" w:hAnsi="Arial"/>
+                <w:color w:val="1A1A1A"/>
+                <w:sz w:val="18"/>
+                <w:szCs w:val="18"/>
+              </w:rPr>
+              <w:t xml:space="preserve">Der New Yorker Galerist Louis K. Meisel prägt den Begriff „Photo-Realism“; 1970 erstmals gedruckt (Whitney Museum, „22 Realists“).</w:t>
             </w:r>
           </w:p>
         </w:tc>
@@ -372,7 +372,7 @@
           </w:tcPr>
           <w:p>
             <w:pPr>
-              <w:spacing w:after="0" w:before="0" w:line="252"/>
+              <w:spacing w:after="0" w:before="0" w:line="252" w:lineRule="auto"/>
             </w:pPr>
             <w:r>
               <w:rPr>
@@ -400,16 +400,16 @@
           </w:tcPr>
           <w:p>
             <w:pPr>
-              <w:spacing w:after="0" w:before="0" w:line="252"/>
-            </w:pPr>
-            <w:r>
-              <w:rPr>
-                <w:rFonts w:ascii="Arial" w:cs="Arial" w:eastAsia="Arial" w:hAnsi="Arial"/>
-                <w:color w:val="1A1A1A"/>
-                <w:sz w:val="18"/>
-                <w:szCs w:val="18"/>
-              </w:rPr>
-              <w:t xml:space="preserve">documenta 5 in Kassel zeigt zahlreiche Fotorealisten – Durchbruch in Europa.</w:t>
+              <w:spacing w:after="0" w:before="0" w:line="252" w:lineRule="auto"/>
+            </w:pPr>
+            <w:r>
+              <w:rPr>
+                <w:rFonts w:ascii="Arial" w:cs="Arial" w:eastAsia="Arial" w:hAnsi="Arial"/>
+                <w:color w:val="1A1A1A"/>
+                <w:sz w:val="18"/>
+                <w:szCs w:val="18"/>
+              </w:rPr>
+              <w:t xml:space="preserve">documenta 5 in Kassel zeigt zahlreiche Fotorealisten – erster großer Auftritt in Europa. Meisel formuliert fünf Kriterien.</w:t>
             </w:r>
           </w:p>
         </w:tc>
@@ -429,7 +429,7 @@
           </w:tcPr>
           <w:p>
             <w:pPr>
-              <w:spacing w:after="0" w:before="0" w:line="252"/>
+              <w:spacing w:after="0" w:before="0" w:line="252" w:lineRule="auto"/>
             </w:pPr>
             <w:r>
               <w:rPr>
@@ -458,16 +458,16 @@
           </w:tcPr>
           <w:p>
             <w:pPr>
-              <w:spacing w:after="0" w:before="0" w:line="252"/>
-            </w:pPr>
-            <w:r>
-              <w:rPr>
-                <w:rFonts w:ascii="Arial" w:cs="Arial" w:eastAsia="Arial" w:hAnsi="Arial"/>
-                <w:color w:val="1A1A1A"/>
-                <w:sz w:val="18"/>
-                <w:szCs w:val="18"/>
-              </w:rPr>
-              <w:t xml:space="preserve">Eine Ausstellung der Galerie Isy Brachot in Brüssel prägt den Begriff „Hyperréalisme“ (Hyperrealismus).</w:t>
+              <w:spacing w:after="0" w:before="0" w:line="252" w:lineRule="auto"/>
+            </w:pPr>
+            <w:r>
+              <w:rPr>
+                <w:rFonts w:ascii="Arial" w:cs="Arial" w:eastAsia="Arial" w:hAnsi="Arial"/>
+                <w:color w:val="1A1A1A"/>
+                <w:sz w:val="18"/>
+                <w:szCs w:val="18"/>
+              </w:rPr>
+              <w:t xml:space="preserve">Die Ausstellung „Hyperréalisme“ der Galerie Isy Brachot in Brüssel prägt den Begriff Hyperrealismus.</w:t>
             </w:r>
           </w:p>
         </w:tc>
@@ -486,7 +486,7 @@
           </w:tcPr>
           <w:p>
             <w:pPr>
-              <w:spacing w:after="0" w:before="0" w:line="252"/>
+              <w:spacing w:after="0" w:before="0" w:line="252" w:lineRule="auto"/>
             </w:pPr>
             <w:r>
               <w:rPr>
@@ -514,16 +514,16 @@
           </w:tcPr>
           <w:p>
             <w:pPr>
-              <w:spacing w:after="0" w:before="0" w:line="252"/>
-            </w:pPr>
-            <w:r>
-              <w:rPr>
-                <w:rFonts w:ascii="Arial" w:cs="Arial" w:eastAsia="Arial" w:hAnsi="Arial"/>
-                <w:color w:val="1A1A1A"/>
-                <w:sz w:val="18"/>
-                <w:szCs w:val="18"/>
-              </w:rPr>
-              <w:t xml:space="preserve">Meisels Buch „Photorealism“ definiert die Kunstrichtung mit fünf Kriterien.</w:t>
+              <w:spacing w:after="0" w:before="0" w:line="252" w:lineRule="auto"/>
+            </w:pPr>
+            <w:r>
+              <w:rPr>
+                <w:rFonts w:ascii="Arial" w:cs="Arial" w:eastAsia="Arial" w:hAnsi="Arial"/>
+                <w:color w:val="1A1A1A"/>
+                <w:sz w:val="18"/>
+                <w:szCs w:val="18"/>
+              </w:rPr>
+              <w:t xml:space="preserve">Meisels Standardwerk „Photo-Realism“ fasst die erste Generation zusammen.</w:t>
             </w:r>
           </w:p>
         </w:tc>
@@ -543,7 +543,7 @@
           </w:tcPr>
           <w:p>
             <w:pPr>
-              <w:spacing w:after="0" w:before="0" w:line="252"/>
+              <w:spacing w:after="0" w:before="0" w:line="252" w:lineRule="auto"/>
             </w:pPr>
             <w:r>
               <w:rPr>
@@ -572,16 +572,16 @@
           </w:tcPr>
           <w:p>
             <w:pPr>
-              <w:spacing w:after="0" w:before="0" w:line="252"/>
-            </w:pPr>
-            <w:r>
-              <w:rPr>
-                <w:rFonts w:ascii="Arial" w:cs="Arial" w:eastAsia="Arial" w:hAnsi="Arial"/>
-                <w:color w:val="1A1A1A"/>
-                <w:sz w:val="18"/>
-                <w:szCs w:val="18"/>
-              </w:rPr>
-              <w:t xml:space="preserve">Hyperrealismus boomt: digitale Fotografie, extreme Detailtreue, lebensechte Skulpturen aus Silikon.</w:t>
+              <w:spacing w:after="0" w:before="0" w:line="252" w:lineRule="auto"/>
+            </w:pPr>
+            <w:r>
+              <w:rPr>
+                <w:rFonts w:ascii="Arial" w:cs="Arial" w:eastAsia="Arial" w:hAnsi="Arial"/>
+                <w:color w:val="1A1A1A"/>
+                <w:sz w:val="18"/>
+                <w:szCs w:val="18"/>
+              </w:rPr>
+              <w:t xml:space="preserve">Hyperrealismus boomt: digitale Fotografie, extreme Detailtreue, lebensechte Skulpturen aus Silikon (Ron Mueck).</w:t>
             </w:r>
           </w:p>
         </w:tc>
@@ -590,7 +590,7 @@
     <w:p>
       <w:pPr>
         <w:keepNext/>
-        <w:spacing w:after="50" w:before="110" w:line="252"/>
+        <w:spacing w:after="50" w:before="110" w:line="252" w:lineRule="auto"/>
       </w:pPr>
       <w:r>
         <w:rPr>
@@ -639,7 +639,7 @@
           </w:tcPr>
           <w:p>
             <w:pPr>
-              <w:spacing w:after="0" w:before="0" w:line="252"/>
+              <w:spacing w:after="0" w:before="0" w:line="252" w:lineRule="auto"/>
             </w:pPr>
             <w:r>
               <w:rPr>
@@ -666,7 +666,7 @@
           </w:tcPr>
           <w:p>
             <w:pPr>
-              <w:spacing w:after="0" w:before="0" w:line="252"/>
+              <w:spacing w:after="0" w:before="0" w:line="252" w:lineRule="auto"/>
             </w:pPr>
             <w:r>
               <w:rPr>
@@ -686,7 +686,7 @@
                 <w:sz w:val="15"/>
                 <w:szCs w:val="15"/>
               </w:rPr>
-              <w:t xml:space="preserve">  ca. 1966–1980 · zuerst USA, dann Europa</w:t>
+              <w:t xml:space="preserve">  Ende 1960er bis ca. 1980 · USA, dann Europa</w:t>
             </w:r>
           </w:p>
         </w:tc>
@@ -704,7 +704,7 @@
           </w:tcPr>
           <w:p>
             <w:pPr>
-              <w:spacing w:after="0" w:before="0" w:line="252"/>
+              <w:spacing w:after="0" w:before="0" w:line="252" w:lineRule="auto"/>
             </w:pPr>
             <w:r>
               <w:rPr>
@@ -743,7 +743,7 @@
           </w:tcPr>
           <w:p>
             <w:pPr>
-              <w:spacing w:after="0" w:before="0" w:line="252"/>
+              <w:spacing w:after="0" w:before="0" w:line="252" w:lineRule="auto"/>
             </w:pPr>
             <w:r>
               <w:rPr>
@@ -771,7 +771,7 @@
           </w:tcPr>
           <w:p>
             <w:pPr>
-              <w:spacing w:after="0" w:before="0" w:line="252"/>
+              <w:spacing w:after="0" w:before="0" w:line="252" w:lineRule="auto"/>
             </w:pPr>
             <w:r>
               <w:rPr>
@@ -797,7 +797,7 @@
           </w:tcPr>
           <w:p>
             <w:pPr>
-              <w:spacing w:after="0" w:before="0" w:line="252"/>
+              <w:spacing w:after="0" w:before="0" w:line="252" w:lineRule="auto"/>
             </w:pPr>
             <w:r>
               <w:rPr>
@@ -825,7 +825,7 @@
           </w:tcPr>
           <w:p>
             <w:pPr>
-              <w:spacing w:after="0" w:before="0" w:line="252"/>
+              <w:spacing w:after="0" w:before="0" w:line="252" w:lineRule="auto"/>
             </w:pPr>
             <w:r>
               <w:rPr>
@@ -853,7 +853,7 @@
           </w:tcPr>
           <w:p>
             <w:pPr>
-              <w:spacing w:after="0" w:before="0" w:line="252"/>
+              <w:spacing w:after="0" w:before="0" w:line="252" w:lineRule="auto"/>
             </w:pPr>
             <w:r>
               <w:rPr>
@@ -879,7 +879,7 @@
           </w:tcPr>
           <w:p>
             <w:pPr>
-              <w:spacing w:after="0" w:before="0" w:line="252"/>
+              <w:spacing w:after="0" w:before="0" w:line="252" w:lineRule="auto"/>
             </w:pPr>
             <w:r>
               <w:rPr>
@@ -907,7 +907,7 @@
           </w:tcPr>
           <w:p>
             <w:pPr>
-              <w:spacing w:after="0" w:before="0" w:line="252"/>
+              <w:spacing w:after="0" w:before="0" w:line="252" w:lineRule="auto"/>
             </w:pPr>
             <w:r>
               <w:rPr>
@@ -935,7 +935,7 @@
           </w:tcPr>
           <w:p>
             <w:pPr>
-              <w:spacing w:after="0" w:before="0" w:line="252"/>
+              <w:spacing w:after="0" w:before="0" w:line="252" w:lineRule="auto"/>
             </w:pPr>
             <w:r>
               <w:rPr>
@@ -961,7 +961,7 @@
           </w:tcPr>
           <w:p>
             <w:pPr>
-              <w:spacing w:after="0" w:before="0" w:line="252"/>
+              <w:spacing w:after="0" w:before="0" w:line="252" w:lineRule="auto"/>
             </w:pPr>
             <w:r>
               <w:rPr>
@@ -989,7 +989,7 @@
           </w:tcPr>
           <w:p>
             <w:pPr>
-              <w:spacing w:after="0" w:before="0" w:line="252"/>
+              <w:spacing w:after="0" w:before="0" w:line="252" w:lineRule="auto"/>
             </w:pPr>
             <w:r>
               <w:rPr>
@@ -1017,7 +1017,7 @@
           </w:tcPr>
           <w:p>
             <w:pPr>
-              <w:spacing w:after="0" w:before="0" w:line="252"/>
+              <w:spacing w:after="0" w:before="0" w:line="252" w:lineRule="auto"/>
             </w:pPr>
             <w:r>
               <w:rPr>
@@ -1043,7 +1043,7 @@
           </w:tcPr>
           <w:p>
             <w:pPr>
-              <w:spacing w:after="0" w:before="0" w:line="252"/>
+              <w:spacing w:after="0" w:before="0" w:line="252" w:lineRule="auto"/>
             </w:pPr>
             <w:r>
               <w:rPr>
@@ -1146,7 +1146,7 @@
           <w:sz w:val="18"/>
           <w:szCs w:val="18"/>
         </w:rPr>
-        <w:t xml:space="preserve">Das Foto wird mit Rasternetz oder Projektor exakt auf die Leinwand übertragen (Abb. 2).</w:t>
+        <w:t xml:space="preserve">Das Foto wird mit Rasternetz oder Diaprojektor genau auf die Leinwand übertragen (Abb. 2).</w:t>
       </w:r>
     </w:p>
     <w:p>
@@ -1206,7 +1206,7 @@
           <w:sz w:val="18"/>
           <w:szCs w:val="18"/>
         </w:rPr>
-        <w:t xml:space="preserve">Bildausschnitt, Licht, Spiegelungen und sogar Unschärfen werden vom Foto übernommen (Abb. 1, 2).</w:t>
+        <w:t xml:space="preserve">Bildausschnitt, Licht und Spiegelungen stammen aus dem Foto (Abb. 1) – Close malt sogar die Unschärfe der Kamera mit (Abb. 2).</w:t>
       </w:r>
     </w:p>
     <w:p>
@@ -1301,7 +1301,7 @@
     </w:p>
     <w:p>
       <w:pPr>
-        <w:spacing w:after="0" w:before="70" w:line="252"/>
+        <w:spacing w:after="0" w:before="70" w:line="252" w:lineRule="auto"/>
       </w:pPr>
       <w:r>
         <w:rPr>
@@ -1321,7 +1321,7 @@
           <w:sz w:val="18"/>
           <w:szCs w:val="18"/>
         </w:rPr>
-        <w:t xml:space="preserve">Ein Fotorealist (1) nutzt Kamera und Foto, um Informationen zu sammeln, (2) überträgt sie mechanisch oder halbmechanisch auf die Leinwand, (3) hat das technische Können, das Werk fotografisch wirken zu lassen, (4) hat bis 1972 als Fotorealist ausgestellt und (5) mindestens fünf Jahre fotorealistisch gearbeitet.</w:t>
+        <w:t xml:space="preserve">(formuliert 1972) Ein Fotorealist (1) nutzt Kamera und Foto, um Informationen zu sammeln, (2) überträgt sie mechanisch oder halbmechanisch auf die Leinwand, (3) hat das technische Können, das Werk fotografisch wirken zu lassen, (4) hat bis 1972 als Fotorealist ausgestellt und (5) mindestens fünf Jahre fotorealistisch gearbeitet.</w:t>
       </w:r>
     </w:p>
     <w:p>
@@ -1419,7 +1419,7 @@
                 <w:sz w:val="18"/>
                 <w:szCs w:val="18"/>
               </w:rPr>
-              <w:t xml:space="preserve">Spiegelungen in Glas, Chrom und Lack (Estes, Eddy)</w:t>
+              <w:t xml:space="preserve">Spiegelungen, Reklame, Leuchtschrift (Estes, Eddy, Cottingham)</w:t>
             </w:r>
           </w:p>
           <w:p>
@@ -1440,16 +1440,16 @@
                 <w:sz w:val="18"/>
                 <w:szCs w:val="18"/>
               </w:rPr>
-              <w:t xml:space="preserve">Autos und Motorräder: </w:t>
-            </w:r>
-            <w:r>
-              <w:rPr>
-                <w:rFonts w:ascii="Arial" w:cs="Arial" w:eastAsia="Arial" w:hAnsi="Arial"/>
-                <w:color w:val="1A1A1A"/>
-                <w:sz w:val="18"/>
-                <w:szCs w:val="18"/>
-              </w:rPr>
-              <w:t xml:space="preserve">Symbole des „American Way of Life“ (Bechtle, Blackwell)</w:t>
+              <w:t xml:space="preserve">Autos und Wohnwagen: </w:t>
+            </w:r>
+            <w:r>
+              <w:rPr>
+                <w:rFonts w:ascii="Arial" w:cs="Arial" w:eastAsia="Arial" w:hAnsi="Arial"/>
+                <w:color w:val="1A1A1A"/>
+                <w:sz w:val="18"/>
+                <w:szCs w:val="18"/>
+              </w:rPr>
+              <w:t xml:space="preserve">Chrom und Lack als Symbole des „American Way of Life“ (Bechtle, Goings, Blackwell)</w:t>
             </w:r>
           </w:p>
           <w:p>
@@ -1651,7 +1651,7 @@
           </w:tcPr>
           <w:p>
             <w:pPr>
-              <w:spacing w:after="0" w:before="0" w:line="252"/>
+              <w:spacing w:after="0" w:before="0" w:line="252" w:lineRule="auto"/>
             </w:pPr>
             <w:r>
               <w:rPr>
@@ -1679,7 +1679,7 @@
           </w:tcPr>
           <w:p>
             <w:pPr>
-              <w:spacing w:after="0" w:before="0" w:line="252"/>
+              <w:spacing w:after="0" w:before="0" w:line="252" w:lineRule="auto"/>
             </w:pPr>
             <w:r>
               <w:rPr>
@@ -1706,7 +1706,7 @@
           </w:tcPr>
           <w:p>
             <w:pPr>
-              <w:spacing w:after="0" w:before="0" w:line="252"/>
+              <w:spacing w:after="0" w:before="0" w:line="252" w:lineRule="auto"/>
             </w:pPr>
             <w:r>
               <w:rPr>
@@ -1736,7 +1736,7 @@
           </w:tcPr>
           <w:p>
             <w:pPr>
-              <w:spacing w:after="0" w:before="0" w:line="252"/>
+              <w:spacing w:after="0" w:before="0" w:line="252" w:lineRule="auto"/>
             </w:pPr>
             <w:r>
               <w:rPr>
@@ -1761,7 +1761,7 @@
           </w:p>
           <w:p>
             <w:pPr>
-              <w:spacing w:after="0" w:before="0" w:line="252"/>
+              <w:spacing w:after="0" w:before="0" w:line="252" w:lineRule="auto"/>
             </w:pPr>
             <w:r>
               <w:rPr>
@@ -1770,7 +1770,7 @@
                 <w:sz w:val="16"/>
                 <w:szCs w:val="16"/>
               </w:rPr>
-              <w:t xml:space="preserve">Stadtansichten New Yorks mit Spiegelungen in Glas und Chrom</w:t>
+              <w:t xml:space="preserve">Mitbegründer; New Yorker Stadtansichten voller Spiegelungen</w:t>
             </w:r>
           </w:p>
         </w:tc>
@@ -1787,7 +1787,7 @@
           </w:tcPr>
           <w:p>
             <w:pPr>
-              <w:spacing w:after="0" w:before="0" w:line="252"/>
+              <w:spacing w:after="0" w:before="0" w:line="252" w:lineRule="auto"/>
             </w:pPr>
             <w:r>
               <w:rPr>
@@ -1813,7 +1813,7 @@
           </w:tcPr>
           <w:p>
             <w:pPr>
-              <w:spacing w:after="0" w:before="0" w:line="252"/>
+              <w:spacing w:after="0" w:before="0" w:line="252" w:lineRule="auto"/>
             </w:pPr>
             <w:r>
               <w:rPr>
@@ -1838,7 +1838,7 @@
           </w:p>
           <w:p>
             <w:pPr>
-              <w:spacing w:after="0" w:before="0" w:line="252"/>
+              <w:spacing w:after="0" w:before="0" w:line="252" w:lineRule="auto"/>
             </w:pPr>
             <w:r>
               <w:rPr>
@@ -1866,7 +1866,7 @@
           </w:tcPr>
           <w:p>
             <w:pPr>
-              <w:spacing w:after="0" w:before="0" w:line="252"/>
+              <w:spacing w:after="0" w:before="0" w:line="252" w:lineRule="auto"/>
             </w:pPr>
             <w:r>
               <w:rPr>
@@ -1891,7 +1891,7 @@
           </w:p>
           <w:p>
             <w:pPr>
-              <w:spacing w:after="0" w:before="0" w:line="252"/>
+              <w:spacing w:after="0" w:before="0" w:line="252" w:lineRule="auto"/>
             </w:pPr>
             <w:r>
               <w:rPr>
@@ -1917,7 +1917,7 @@
           </w:tcPr>
           <w:p>
             <w:pPr>
-              <w:spacing w:after="0" w:before="0" w:line="252"/>
+              <w:spacing w:after="0" w:before="0" w:line="252" w:lineRule="auto"/>
             </w:pPr>
             <w:r>
               <w:rPr>
@@ -1943,7 +1943,7 @@
           </w:tcPr>
           <w:p>
             <w:pPr>
-              <w:spacing w:after="0" w:before="0" w:line="252"/>
+              <w:spacing w:after="0" w:before="0" w:line="252" w:lineRule="auto"/>
             </w:pPr>
             <w:r>
               <w:rPr>
@@ -1968,7 +1968,7 @@
           </w:p>
           <w:p>
             <w:pPr>
-              <w:spacing w:after="0" w:before="0" w:line="252"/>
+              <w:spacing w:after="0" w:before="0" w:line="252" w:lineRule="auto"/>
             </w:pPr>
             <w:r>
               <w:rPr>
@@ -1996,7 +1996,7 @@
           </w:tcPr>
           <w:p>
             <w:pPr>
-              <w:spacing w:after="0" w:before="0" w:line="252"/>
+              <w:spacing w:after="0" w:before="0" w:line="252" w:lineRule="auto"/>
             </w:pPr>
             <w:r>
               <w:rPr>
@@ -2021,7 +2021,7 @@
           </w:p>
           <w:p>
             <w:pPr>
-              <w:spacing w:after="0" w:before="0" w:line="252"/>
+              <w:spacing w:after="0" w:before="0" w:line="252" w:lineRule="auto"/>
             </w:pPr>
             <w:r>
               <w:rPr>
@@ -2047,7 +2047,7 @@
           </w:tcPr>
           <w:p>
             <w:pPr>
-              <w:spacing w:after="0" w:before="0" w:line="252"/>
+              <w:spacing w:after="0" w:before="0" w:line="252" w:lineRule="auto"/>
             </w:pPr>
             <w:r>
               <w:rPr>
@@ -2073,7 +2073,7 @@
           </w:tcPr>
           <w:p>
             <w:pPr>
-              <w:spacing w:after="0" w:before="0" w:line="252"/>
+              <w:spacing w:after="0" w:before="0" w:line="252" w:lineRule="auto"/>
             </w:pPr>
             <w:r>
               <w:rPr>
@@ -2093,12 +2093,12 @@
                 <w:sz w:val="15"/>
                 <w:szCs w:val="15"/>
               </w:rPr>
-              <w:t xml:space="preserve">  * 1958 · Australien</w:t>
-            </w:r>
-          </w:p>
-          <w:p>
-            <w:pPr>
-              <w:spacing w:after="0" w:before="0" w:line="252"/>
+              <w:t xml:space="preserve">  * 1958 · Australien, lebt in London</w:t>
+            </w:r>
+          </w:p>
+          <w:p>
+            <w:pPr>
+              <w:spacing w:after="0" w:before="0" w:line="252" w:lineRule="auto"/>
             </w:pPr>
             <w:r>
               <w:rPr>
@@ -2126,7 +2126,7 @@
           </w:tcPr>
           <w:p>
             <w:pPr>
-              <w:spacing w:after="0" w:before="0" w:line="252"/>
+              <w:spacing w:after="0" w:before="0" w:line="252" w:lineRule="auto"/>
             </w:pPr>
             <w:r>
               <w:rPr>
@@ -2151,7 +2151,7 @@
           </w:p>
           <w:p>
             <w:pPr>
-              <w:spacing w:after="0" w:before="0" w:line="252"/>
+              <w:spacing w:after="0" w:before="0" w:line="252" w:lineRule="auto"/>
             </w:pPr>
             <w:r>
               <w:rPr>
@@ -2160,7 +2160,7 @@
                 <w:sz w:val="16"/>
                 <w:szCs w:val="16"/>
               </w:rPr>
-              <w:t xml:space="preserve">Pionierin des Fotorealismus; Vanitas-Stillleben mit Airbrush</w:t>
+              <w:t xml:space="preserve">Wichtigste Künstlerin der ersten Generation; Vanitas-Stillleben</w:t>
             </w:r>
           </w:p>
         </w:tc>
@@ -2177,7 +2177,7 @@
           </w:tcPr>
           <w:p>
             <w:pPr>
-              <w:spacing w:after="0" w:before="0" w:line="252"/>
+              <w:spacing w:after="0" w:before="0" w:line="252" w:lineRule="auto"/>
             </w:pPr>
             <w:r>
               <w:rPr>
@@ -2203,7 +2203,7 @@
           </w:tcPr>
           <w:p>
             <w:pPr>
-              <w:spacing w:after="0" w:before="0" w:line="252"/>
+              <w:spacing w:after="0" w:before="0" w:line="252" w:lineRule="auto"/>
             </w:pPr>
             <w:r>
               <w:rPr>
@@ -2228,7 +2228,7 @@
           </w:p>
           <w:p>
             <w:pPr>
-              <w:spacing w:after="0" w:before="0" w:line="252"/>
+              <w:spacing w:after="0" w:before="0" w:line="252" w:lineRule="auto"/>
             </w:pPr>
             <w:r>
               <w:rPr>
@@ -2256,7 +2256,7 @@
           </w:tcPr>
           <w:p>
             <w:pPr>
-              <w:spacing w:after="0" w:before="0" w:line="252"/>
+              <w:spacing w:after="0" w:before="0" w:line="252" w:lineRule="auto"/>
             </w:pPr>
             <w:r>
               <w:rPr>
@@ -2281,7 +2281,7 @@
           </w:p>
           <w:p>
             <w:pPr>
-              <w:spacing w:after="0" w:before="0" w:line="252"/>
+              <w:spacing w:after="0" w:before="0" w:line="252" w:lineRule="auto"/>
             </w:pPr>
             <w:r>
               <w:rPr>
@@ -2307,7 +2307,7 @@
           </w:tcPr>
           <w:p>
             <w:pPr>
-              <w:spacing w:after="0" w:before="0" w:line="252"/>
+              <w:spacing w:after="0" w:before="0" w:line="252" w:lineRule="auto"/>
             </w:pPr>
             <w:r>
               <w:rPr>
@@ -2333,7 +2333,7 @@
           </w:tcPr>
           <w:p>
             <w:pPr>
-              <w:spacing w:after="0" w:before="0" w:line="252"/>
+              <w:spacing w:after="0" w:before="0" w:line="252" w:lineRule="auto"/>
             </w:pPr>
             <w:r>
               <w:rPr>
@@ -2358,7 +2358,7 @@
           </w:p>
           <w:p>
             <w:pPr>
-              <w:spacing w:after="0" w:before="0" w:line="252"/>
+              <w:spacing w:after="0" w:before="0" w:line="252" w:lineRule="auto"/>
             </w:pPr>
             <w:r>
               <w:rPr>
@@ -2386,7 +2386,7 @@
           </w:tcPr>
           <w:p>
             <w:pPr>
-              <w:spacing w:after="0" w:before="0" w:line="252"/>
+              <w:spacing w:after="0" w:before="0" w:line="252" w:lineRule="auto"/>
             </w:pPr>
             <w:r>
               <w:rPr>
@@ -2411,7 +2411,7 @@
           </w:p>
           <w:p>
             <w:pPr>
-              <w:spacing w:after="0" w:before="0" w:line="252"/>
+              <w:spacing w:after="0" w:before="0" w:line="252" w:lineRule="auto"/>
             </w:pPr>
             <w:r>
               <w:rPr>
@@ -2420,7 +2420,7 @@
                 <w:sz w:val="16"/>
                 <w:szCs w:val="16"/>
               </w:rPr>
-              <w:t xml:space="preserve">Bedeutendster europäischer Fotorealist; riesige Porträts</w:t>
+              <w:t xml:space="preserve">Wichtigster europäischer Fotorealist; Durchbruch auf der documenta 5</w:t>
             </w:r>
           </w:p>
         </w:tc>
@@ -2437,7 +2437,7 @@
           </w:tcPr>
           <w:p>
             <w:pPr>
-              <w:spacing w:after="0" w:before="0" w:line="252"/>
+              <w:spacing w:after="0" w:before="0" w:line="252" w:lineRule="auto"/>
             </w:pPr>
             <w:r>
               <w:rPr>
@@ -2463,18 +2463,18 @@
           </w:tcPr>
           <w:p>
             <w:pPr>
-              <w:spacing w:after="0" w:before="0" w:line="252"/>
-            </w:pPr>
-            <w:r>
-              <w:rPr>
-                <w:rFonts w:ascii="Arial" w:cs="Arial" w:eastAsia="Arial" w:hAnsi="Arial"/>
-                <w:b/>
-                <w:bCs/>
-                <w:color w:val="1A1A1A"/>
-                <w:sz w:val="18"/>
-                <w:szCs w:val="18"/>
-              </w:rPr>
-              <w:t xml:space="preserve">Alyssa Monks</w:t>
+              <w:spacing w:after="0" w:before="0" w:line="252" w:lineRule="auto"/>
+            </w:pPr>
+            <w:r>
+              <w:rPr>
+                <w:rFonts w:ascii="Arial" w:cs="Arial" w:eastAsia="Arial" w:hAnsi="Arial"/>
+                <w:b/>
+                <w:bCs/>
+                <w:color w:val="1A1A1A"/>
+                <w:sz w:val="18"/>
+                <w:szCs w:val="18"/>
+              </w:rPr>
+              <w:t xml:space="preserve">Robin Eley</w:t>
             </w:r>
             <w:r>
               <w:rPr>
@@ -2483,12 +2483,12 @@
                 <w:sz w:val="15"/>
                 <w:szCs w:val="15"/>
               </w:rPr>
-              <w:t xml:space="preserve">  * 1977 · USA</w:t>
-            </w:r>
-          </w:p>
-          <w:p>
-            <w:pPr>
-              <w:spacing w:after="0" w:before="0" w:line="252"/>
+              <w:t xml:space="preserve">  * 1978 · Großbritannien/Australien</w:t>
+            </w:r>
+          </w:p>
+          <w:p>
+            <w:pPr>
+              <w:spacing w:after="0" w:before="0" w:line="252" w:lineRule="auto"/>
             </w:pPr>
             <w:r>
               <w:rPr>
@@ -2497,7 +2497,7 @@
                 <w:sz w:val="16"/>
                 <w:szCs w:val="16"/>
               </w:rPr>
-              <w:t xml:space="preserve">Körper hinter Wasser und beschlagenem Glas</w:t>
+              <w:t xml:space="preserve">Menschen in Plastikfolie – die Folie ist nur gemalt</w:t>
             </w:r>
           </w:p>
         </w:tc>
@@ -2601,7 +2601,7 @@
                 </w:tcPr>
                 <w:p>
                   <w:pPr>
-                    <w:spacing w:after="0" w:before="0" w:line="252"/>
+                    <w:spacing w:after="0" w:before="0" w:line="252" w:lineRule="auto"/>
                     <w:jc w:val="center"/>
                   </w:pPr>
                   <w:r>
@@ -2618,7 +2618,7 @@
                 </w:p>
                 <w:p>
                   <w:pPr>
-                    <w:spacing w:after="0" w:before="0" w:line="252"/>
+                    <w:spacing w:after="0" w:before="0" w:line="252" w:lineRule="auto"/>
                     <w:jc w:val="center"/>
                   </w:pPr>
                   <w:r>
@@ -2638,7 +2638,7 @@
           </w:tbl>
           <w:p>
             <w:pPr>
-              <w:spacing w:after="40" w:before="0" w:line="252"/>
+              <w:spacing w:after="40" w:before="0" w:line="252" w:lineRule="auto"/>
             </w:pPr>
             <w:r>
               <w:rPr>
@@ -2652,7 +2652,7 @@
           </w:p>
           <w:p>
             <w:pPr>
-              <w:spacing w:after="20" w:before="0" w:line="252"/>
+              <w:spacing w:after="20" w:before="0" w:line="252" w:lineRule="auto"/>
             </w:pPr>
             <w:r>
               <w:rPr>
@@ -2703,7 +2703,7 @@
           </w:p>
           <w:p>
             <w:pPr>
-              <w:spacing w:after="30" w:before="0" w:line="252"/>
+              <w:spacing w:after="30" w:before="0" w:line="252" w:lineRule="auto"/>
             </w:pPr>
             <w:r>
               <w:rPr>
@@ -2717,7 +2717,7 @@
           </w:p>
           <w:p>
             <w:pPr>
-              <w:spacing w:after="0" w:before="0" w:line="252"/>
+              <w:spacing w:after="0" w:before="0" w:line="252" w:lineRule="auto"/>
             </w:pPr>
             <w:r>
               <w:rPr>
@@ -2726,7 +2726,7 @@
                 <w:sz w:val="16"/>
                 <w:szCs w:val="16"/>
               </w:rPr>
-              <w:t xml:space="preserve">Telefonzellen in New York: Spiegelungen in Glas und Metall, durchgehende Schärfe, keine Pinselspur, neutrales Alltagsmotiv.</w:t>
+              <w:t xml:space="preserve">Telefonzellen in New York: Spiegelungen in Glas und Metall, Nah und Fern gleich scharf (aus mehreren Fotos zusammengesetzt), keine Pinselspur.</w:t>
             </w:r>
           </w:p>
         </w:tc>
@@ -2743,7 +2743,7 @@
           </w:tcPr>
           <w:p>
             <w:pPr>
-              <w:spacing w:after="40" w:before="0" w:line="252"/>
+              <w:spacing w:after="40" w:before="0" w:line="252" w:lineRule="auto"/>
             </w:pPr>
             <w:r>
               <w:rPr>
@@ -2802,7 +2802,7 @@
                 </w:tcPr>
                 <w:p>
                   <w:pPr>
-                    <w:spacing w:after="0" w:before="0" w:line="252"/>
+                    <w:spacing w:after="0" w:before="0" w:line="252" w:lineRule="auto"/>
                     <w:jc w:val="center"/>
                   </w:pPr>
                   <w:r>
@@ -2819,7 +2819,7 @@
                 </w:p>
                 <w:p>
                   <w:pPr>
-                    <w:spacing w:after="0" w:before="0" w:line="252"/>
+                    <w:spacing w:after="0" w:before="0" w:line="252" w:lineRule="auto"/>
                     <w:jc w:val="center"/>
                   </w:pPr>
                   <w:r>
@@ -2839,7 +2839,7 @@
           </w:tbl>
           <w:p>
             <w:pPr>
-              <w:spacing w:after="40" w:before="0" w:line="252"/>
+              <w:spacing w:after="40" w:before="0" w:line="252" w:lineRule="auto"/>
             </w:pPr>
             <w:r>
               <w:rPr>
@@ -2853,7 +2853,7 @@
           </w:p>
           <w:p>
             <w:pPr>
-              <w:spacing w:after="20" w:before="0" w:line="252"/>
+              <w:spacing w:after="20" w:before="0" w:line="252" w:lineRule="auto"/>
             </w:pPr>
             <w:r>
               <w:rPr>
@@ -2904,7 +2904,7 @@
           </w:p>
           <w:p>
             <w:pPr>
-              <w:spacing w:after="30" w:before="0" w:line="252"/>
+              <w:spacing w:after="30" w:before="0" w:line="252" w:lineRule="auto"/>
             </w:pPr>
             <w:r>
               <w:rPr>
@@ -2913,12 +2913,12 @@
                 <w:sz w:val="14"/>
                 <w:szCs w:val="14"/>
               </w:rPr>
-              <w:t xml:space="preserve">Acryl auf Leinwand, 273 × 212 cm; Walker Art Center, Minneapolis</w:t>
-            </w:r>
-          </w:p>
-          <w:p>
-            <w:pPr>
-              <w:spacing w:after="0" w:before="0" w:line="252"/>
+              <w:t xml:space="preserve">Acryl auf Leinwand (Airbrush), 273,1 × 212,1 cm; Walker Art Center, Minneapolis</w:t>
+            </w:r>
+          </w:p>
+          <w:p>
+            <w:pPr>
+              <w:spacing w:after="0" w:before="0" w:line="252" w:lineRule="auto"/>
             </w:pPr>
             <w:r>
               <w:rPr>
@@ -2927,7 +2927,7 @@
                 <w:sz w:val="16"/>
                 <w:szCs w:val="16"/>
               </w:rPr>
-              <w:t xml:space="preserve">Selbstporträt, 2,73 m hoch: per Raster vom Foto übertragen; die fotografische Unschärfe an Haaren und Schultern wird mitgemalt.</w:t>
+              <w:t xml:space="preserve">Selbstbildnis, 2,73 m hoch: per Raster vom Foto übertragen, mit Airbrush gemalt; die Unschärfe von Nasenspitze und Ohren ist mitgemalt.</w:t>
             </w:r>
           </w:p>
         </w:tc>
@@ -2944,7 +2944,7 @@
           </w:tcPr>
           <w:p>
             <w:pPr>
-              <w:spacing w:after="40" w:before="0" w:line="252"/>
+              <w:spacing w:after="40" w:before="0" w:line="252" w:lineRule="auto"/>
             </w:pPr>
             <w:r>
               <w:rPr>
@@ -3003,7 +3003,7 @@
                 </w:tcPr>
                 <w:p>
                   <w:pPr>
-                    <w:spacing w:after="0" w:before="0" w:line="252"/>
+                    <w:spacing w:after="0" w:before="0" w:line="252" w:lineRule="auto"/>
                     <w:jc w:val="center"/>
                   </w:pPr>
                   <w:r>
@@ -3020,7 +3020,7 @@
                 </w:p>
                 <w:p>
                   <w:pPr>
-                    <w:spacing w:after="0" w:before="0" w:line="252"/>
+                    <w:spacing w:after="0" w:before="0" w:line="252" w:lineRule="auto"/>
                     <w:jc w:val="center"/>
                   </w:pPr>
                   <w:r>
@@ -3040,7 +3040,7 @@
           </w:tbl>
           <w:p>
             <w:pPr>
-              <w:spacing w:after="40" w:before="0" w:line="252"/>
+              <w:spacing w:after="40" w:before="0" w:line="252" w:lineRule="auto"/>
             </w:pPr>
             <w:r>
               <w:rPr>
@@ -3054,7 +3054,7 @@
           </w:p>
           <w:p>
             <w:pPr>
-              <w:spacing w:after="20" w:before="0" w:line="252"/>
+              <w:spacing w:after="20" w:before="0" w:line="252" w:lineRule="auto"/>
             </w:pPr>
             <w:r>
               <w:rPr>
@@ -3100,12 +3100,12 @@
                 <w:sz w:val="16"/>
                 <w:szCs w:val="16"/>
               </w:rPr>
-              <w:t xml:space="preserve">, 1969</w:t>
-            </w:r>
-          </w:p>
-          <w:p>
-            <w:pPr>
-              <w:spacing w:after="30" w:before="0" w:line="252"/>
+              <w:t xml:space="preserve">, 1969/70</w:t>
+            </w:r>
+          </w:p>
+          <w:p>
+            <w:pPr>
+              <w:spacing w:after="30" w:before="0" w:line="252" w:lineRule="auto"/>
             </w:pPr>
             <w:r>
               <w:rPr>
@@ -3114,12 +3114,12 @@
                 <w:sz w:val="14"/>
                 <w:szCs w:val="14"/>
               </w:rPr>
-              <w:t xml:space="preserve">Polyester, Glasfaser, Kleidung, Einkaufswagen, lebensgroß; Ludwig Forum für Internationale Kunst, Aachen</w:t>
-            </w:r>
-          </w:p>
-          <w:p>
-            <w:pPr>
-              <w:spacing w:after="0" w:before="0" w:line="252"/>
+              <w:t xml:space="preserve">Polyesterharz und Glasfaser, bemalt; echte Kleidung und Waren, lebensgroß; Ludwig Forum für Internationale Kunst, Aachen</w:t>
+            </w:r>
+          </w:p>
+          <w:p>
+            <w:pPr>
+              <w:spacing w:after="0" w:before="0" w:line="252" w:lineRule="auto"/>
             </w:pPr>
             <w:r>
               <w:rPr>
@@ -3128,7 +3128,7 @@
                 <w:sz w:val="16"/>
                 <w:szCs w:val="16"/>
               </w:rPr>
-              <w:t xml:space="preserve">Lebensgroße Figur mit echter Kleidung und Einkaufswagen – im Museum oft für eine echte Besucherin gehalten.</w:t>
+              <w:t xml:space="preserve">Abguss vom lebenden Modell, naturgetreu bemalt, echte Kleidung und Waren – im Museum oft für eine echte Besucherin gehalten.</w:t>
             </w:r>
           </w:p>
         </w:tc>
@@ -3165,7 +3165,7 @@
           </w:tcPr>
           <w:p>
             <w:pPr>
-              <w:spacing w:after="30" w:before="0" w:line="252"/>
+              <w:spacing w:after="30" w:before="0" w:line="252" w:lineRule="auto"/>
             </w:pPr>
             <w:r>
               <w:rPr>
@@ -3192,7 +3192,7 @@
           </w:p>
           <w:p>
             <w:pPr>
-              <w:spacing w:after="0" w:before="0" w:line="252"/>
+              <w:spacing w:after="0" w:before="0" w:line="252" w:lineRule="auto"/>
             </w:pPr>
             <w:r>
               <w:rPr>

</xml_diff>